<commit_message>
Seven Periods: Elternbrief ohne Zustimmungspflicht, Rueckmeldung nur bei Ablehnung
Co-Authored-By: Claude Opus 5.5 <noreply@anthropic.com>
Claude-Session: https://claude.ai/code/session_01NqrmztuhGWkCdS8PhNsW1S
</commit_message>
<xml_diff>
--- a/lehrmaterial-tools/projects/seven-periods/Elternbrief_KI-Feedback.docx
+++ b/lehrmaterial-tools/projects/seven-periods/Elternbrief_KI-Feedback.docx
@@ -32,6 +32,12 @@
       <w:pPr/>
       <w:r>
         <w:t xml:space="preserve">im Englischunterricht arbeiten wir zur Vorbereitung auf die Klassenarbeit mit dem Lernspiel „Seven Periods“. Am Ende schreiben die Kinder einen eigenen englischen Text. Danach können sie sich freiwillig Feedback von einer Künstlichen Intelligenz (KI) holen. Darüber möchte ich Sie kurz informieren.</w:t>
+      </w:r>
+    </w:p>
+    <w:p>
+      <w:pPr/>
+      <w:r>
+        <w:t xml:space="preserve">Im Unterricht arbeiten wir selbstverständlich weiterhin regelmäßig an Texten. Das KI-Feedback ist ein zusätzliches Angebot für alle, die zu Hause weiterlernen möchten.</w:t>
       </w:r>
     </w:p>
     <w:p>
@@ -127,7 +133,7 @@
     <w:p>
       <w:pPr/>
       <w:r>
-        <w:t xml:space="preserve">Ob Ihr Kind ein KI-Tool nutzt und welches, entscheiden Sie. Ohne KI hat Ihr Kind keinerlei Nachteile: Es bekommt mein Feedback wie gewohnt. Bei Fragen erreichen Sie mich unter [Kontakt].</w:t>
+        <w:t xml:space="preserve">Ob Ihr Kind zu Hause ein KI-Tool nutzt und welches, entscheiden Sie. Eine Zustimmung brauche ich dafür nicht. Möchten Sie das nicht, gibt Ihr Kind mir seinen Text, und es bekommt mein Feedback wie gewohnt. Nachteile entstehen dadurch keine. Bei Fragen erreichen Sie mich unter [Kontakt].</w:t>
       </w:r>
     </w:p>
     <w:p>
@@ -147,7 +153,7 @@
         <w:pStyle w:val="Heading2"/>
       </w:pPr>
       <w:r>
-        <w:t xml:space="preserve">Rückmeldung (bitte bis [Datum] zurückgeben)</w:t>
+        <w:t xml:space="preserve">Rückmeldung (nur zurückgeben, wenn Ihr Kind kein KI-Tool nutzen soll)</w:t>
       </w:r>
     </w:p>
     <w:p>
@@ -157,27 +163,9 @@
       </w:r>
     </w:p>
     <w:p>
-      <w:pPr>
-        <w:pStyle w:val="ListParagraph"/>
-        <w:numPr>
-          <w:ilvl w:val="0"/>
-          <w:numId w:val="3"/>
-        </w:numPr>
-      </w:pPr>
-      <w:r>
-        <w:t xml:space="preserve">☐ Mein Kind darf zu Hause ein KI-Tool für Feedback nutzen, das wir als Eltern ausgewählt haben.</w:t>
-      </w:r>
-    </w:p>
-    <w:p>
-      <w:pPr>
-        <w:pStyle w:val="ListParagraph"/>
-        <w:numPr>
-          <w:ilvl w:val="0"/>
-          <w:numId w:val="3"/>
-        </w:numPr>
-      </w:pPr>
-      <w:r>
-        <w:t xml:space="preserve">☐ Mein Kind nutzt kein KI-Tool.</w:t>
+      <w:pPr/>
+      <w:r>
+        <w:t xml:space="preserve">Mein Kind soll kein KI-Tool nutzen. Es gibt seinen Text bis [Datum] bei Ihnen ab und bekommt Ihr Feedback.</w:t>
       </w:r>
     </w:p>
     <w:p>
@@ -372,9 +360,6 @@
     <w:lvlOverride w:ilvl="0">
       <w:startOverride w:val="1"/>
     </w:lvlOverride>
-  </w:num>
-  <w:num w:numId="3">
-    <w:abstractNumId w:val="0"/>
   </w:num>
 </w:numbering>
 </file>

</xml_diff>